<commit_message>
Describe the production steps for the 2026-09-20 set as steps, not as done
Merging into main and touching production is left to the person with access to
it (and to origin), so docs/18 §3.5 now gives the order — deploy, upload the
three files, run backups/reset-legal-versions-20260920.sql — rather than
claiming the reset has happened.

Co-Authored-By: Claude Opus 5 (1M context) <noreply@anthropic.com>
</commit_message>
<xml_diff>
--- a/docs/manuals-docx/18-document-template-variables.docx
+++ b/docs/manuals-docx/18-document-template-variables.docx
@@ -4710,7 +4710,7 @@
           <w:sz w:val="22"/>
           <w:szCs w:val="22"/>
         </w:rPr>
-        <w:t xml:space="preserve">ทั้งสามฉบับเผยแพร่ผ่าน </w:t>
+        <w:t xml:space="preserve">ขึ้น production ด้วยลำดับนี้: deploy </w:t>
       </w:r>
       <w:r>
         <w:rPr>
@@ -4720,7 +4720,7 @@
           <w:szCs w:val="19"/>
           <w:shd w:val="clear" w:fill="F5F6FA"/>
         </w:rPr>
-        <w:t>POST /api/admin/legal-documents/&lt;code&gt;/versions</w:t>
+        <w:t>main</w:t>
       </w:r>
       <w:r>
         <w:rPr>
@@ -4729,7 +4729,62 @@
           <w:sz w:val="22"/>
           <w:szCs w:val="22"/>
         </w:rPr>
-        <w:t xml:space="preserve"> แล้ว</w:t>
+        <w:t xml:space="preserve"> (migration รันเองตอน backend บูต) </w:t>
+      </w:r>
+      <w:r>
+        <w:rPr>
+          <w:rFonts w:ascii="DejaVu Sans" w:hAnsi="DejaVu Sans" w:cs="DejaVu Sans" w:eastAsia="DejaVu Sans"/>
+          <w:color w:val="1A1E33"/>
+          <w:sz w:val="22"/>
+          <w:szCs w:val="22"/>
+        </w:rPr>
+        <w:t>→</w:t>
+      </w:r>
+      <w:r>
+        <w:rPr>
+          <w:rFonts w:ascii="Sarabun" w:hAnsi="Sarabun" w:cs="Sarabun" w:eastAsia="Sarabun"/>
+          <w:color w:val="1A1E33"/>
+          <w:sz w:val="22"/>
+          <w:szCs w:val="22"/>
+        </w:rPr>
+        <w:t xml:space="preserve"> อัปโหลดทั้งสามฉบับ ผ่าน </w:t>
+      </w:r>
+      <w:r>
+        <w:rPr>
+          <w:rFonts w:ascii="DejaVu Sans Mono" w:hAnsi="DejaVu Sans Mono" w:cs="DejaVu Sans Mono" w:eastAsia="DejaVu Sans Mono"/>
+          <w:color w:val="192768"/>
+          <w:sz w:val="19"/>
+          <w:szCs w:val="19"/>
+          <w:shd w:val="clear" w:fill="F5F6FA"/>
+        </w:rPr>
+        <w:t>POST /api/admin/legal-documents/&lt;code&gt;/versions</w:t>
+      </w:r>
+      <w:r>
+        <w:rPr>
+          <w:rFonts w:ascii="Sarabun" w:hAnsi="Sarabun" w:cs="Sarabun" w:eastAsia="Sarabun"/>
+          <w:color w:val="1A1E33"/>
+          <w:sz w:val="22"/>
+          <w:szCs w:val="22"/>
+        </w:rPr>
+        <w:t xml:space="preserve"> </w:t>
+      </w:r>
+      <w:r>
+        <w:rPr>
+          <w:rFonts w:ascii="DejaVu Sans" w:hAnsi="DejaVu Sans" w:cs="DejaVu Sans" w:eastAsia="DejaVu Sans"/>
+          <w:color w:val="1A1E33"/>
+          <w:sz w:val="22"/>
+          <w:szCs w:val="22"/>
+        </w:rPr>
+        <w:t>→</w:t>
+      </w:r>
+      <w:r>
+        <w:rPr>
+          <w:rFonts w:ascii="Sarabun" w:hAnsi="Sarabun" w:cs="Sarabun" w:eastAsia="Sarabun"/>
+          <w:color w:val="1A1E33"/>
+          <w:sz w:val="22"/>
+          <w:szCs w:val="22"/>
+        </w:rPr>
+        <w:t xml:space="preserve"> </w:t>
       </w:r>
       <w:r>
         <w:rPr>
@@ -4740,7 +4795,7 @@
           <w:b w:val="1"/>
           <w:bCs w:val="1"/>
         </w:rPr>
-        <w:t>รีเซ็ตเลข เวอร์ชันเป็น 1</w:t>
+        <w:t>รีเซ็ตเลขเวอร์ชันเป็น 1</w:t>
       </w:r>
       <w:r>
         <w:rPr>
@@ -4749,7 +4804,7 @@
           <w:sz w:val="22"/>
           <w:szCs w:val="22"/>
         </w:rPr>
-        <w:t xml:space="preserve"> ตามที่การ์ดสั่ง — ขั้นตอนเดียวกับ 2026-09-10 (ดู </w:t>
+        <w:t xml:space="preserve"> ตามที่การ์ด สั่ง ด้วย </w:t>
       </w:r>
       <w:r>
         <w:rPr>
@@ -4759,7 +4814,7 @@
           <w:szCs w:val="19"/>
           <w:shd w:val="clear" w:fill="F5F6FA"/>
         </w:rPr>
-        <w:t>CLAUDE.md</w:t>
+        <w:t>backups/reset-legal-versions-20260920.sql</w:t>
       </w:r>
       <w:r>
         <w:rPr>
@@ -4768,7 +4823,26 @@
           <w:sz w:val="22"/>
           <w:szCs w:val="22"/>
         </w:rPr>
-        <w:t xml:space="preserve"> หัวข้อ PDF): เวอร์ชันเก่าถูกลบ หลักฐานการยอมรับที่ชี้อยู่ถูกย้ายมาชี้เวอร์ชันที่เหลือ ไม่ถูกลบ ทำได้เพราะระบบยังไม่เปิดใช้จริง — </w:t>
+        <w:t xml:space="preserve"> (นอก repo — สำรองฐานข้อมูลก่อนเสมอ) ขั้นตอนเดียวกับ 2026-09-10 (ดู </w:t>
+      </w:r>
+      <w:r>
+        <w:rPr>
+          <w:rFonts w:ascii="DejaVu Sans Mono" w:hAnsi="DejaVu Sans Mono" w:cs="DejaVu Sans Mono" w:eastAsia="DejaVu Sans Mono"/>
+          <w:color w:val="192768"/>
+          <w:sz w:val="19"/>
+          <w:szCs w:val="19"/>
+          <w:shd w:val="clear" w:fill="F5F6FA"/>
+        </w:rPr>
+        <w:t>CLAUDE.md</w:t>
+      </w:r>
+      <w:r>
+        <w:rPr>
+          <w:rFonts w:ascii="Sarabun" w:hAnsi="Sarabun" w:cs="Sarabun" w:eastAsia="Sarabun"/>
+          <w:color w:val="1A1E33"/>
+          <w:sz w:val="22"/>
+          <w:szCs w:val="22"/>
+        </w:rPr>
+        <w:t xml:space="preserve"> หัวข้อ PDF): เวอร์ชันเก่าถูกลบ หลักฐานการยอมรับที่ชี้อยู่ ถูกย้ายมาชี้เวอร์ชันที่เหลือ ไม่ถูกลบ ทำได้เพราะระบบยังไม่เปิดใช้จริง — </w:t>
       </w:r>
       <w:r>
         <w:rPr>
@@ -4788,7 +4862,7 @@
           <w:sz w:val="22"/>
           <w:szCs w:val="22"/>
         </w:rPr>
-        <w:t xml:space="preserve"> เวอร์ชันที่หน่วยงานยอมรับคือ หลักฐานว่าเขายอมรับอะไร</w:t>
+        <w:t xml:space="preserve"> เวอร์ชันที่หน่วยงานยอมรับคือหลักฐานว่าเขายอมรับอะไร</w:t>
       </w:r>
     </w:p>
     <w:p>

</xml_diff>